<commit_message>
added learning rate figures
</commit_message>
<xml_diff>
--- a/Paper/Liver_Disease_Paper/Iteration_0/Liver_Disease_Paper.docx
+++ b/Paper/Liver_Disease_Paper/Iteration_0/Liver_Disease_Paper.docx
@@ -752,10 +752,7 @@
     </w:p>
     <w:p>
       <w:r>
-        <w:t xml:space="preserve">Quantitative metrics are not always sufficient to assess a segmentation algorithms efficacy. For large structures, a high Dice Similarity Coefficient (DSC) can hide clinically impactful inaccuracies, while for a smaller structures a low DSC could be misleading. </w:t>
-      </w:r>
-      <w:r>
-        <w:t>Therefore, we wanted to acquired a qualitative assessment of both CRL-met segmentation and ablation segmentation by trained interventional radiologists.</w:t>
+        <w:t>Quantitative metrics are not always sufficient to assess a segmentation algorithms efficacy. For large structures, a high Dice Similarity Coefficient (DSC) can hide clinically impactful inaccuracies, while for a smaller structures a low DSC could be misleading. Therefore, we wanted to acquired a qualitative assessment of both CRL-met segmentation and ablation segmentation by trained interventional radiologists.</w:t>
       </w:r>
     </w:p>
     <w:p>
@@ -1343,12 +1340,18 @@
         <w:lastRenderedPageBreak/>
         <w:t>normal tissue from the disease, we acquired a patient specific mean and standard deviation based on the FWHM of values within the contoured liver. Visually, this appeared to result in a robust method where the disease appeared consistently darker than the normal tissue.</w:t>
       </w:r>
+      <w:r>
+        <w:t xml:space="preserve"> Image intensity outside of the liver is set to be equal to 0 after normalization.</w:t>
+      </w:r>
     </w:p>
     <w:p>
       <w:pPr>
         <w:keepNext/>
       </w:pPr>
       <w:r>
+        <w:rPr>
+          <w:noProof/>
+        </w:rPr>
         <mc:AlternateContent>
           <mc:Choice Requires="wpg">
             <w:drawing>
@@ -1517,6 +1520,9 @@
         <w:keepNext/>
       </w:pPr>
       <w:r>
+        <w:rPr>
+          <w:noProof/>
+        </w:rPr>
         <w:drawing>
           <wp:inline distT="0" distB="0" distL="0" distR="0" wp14:anchorId="269E4C5B" wp14:editId="421E34F5">
             <wp:extent cx="3340383" cy="2163296"/>
@@ -1595,6 +1601,7 @@
         <w:rPr>
           <w:b/>
         </w:rPr>
+        <w:lastRenderedPageBreak/>
         <w:t xml:space="preserve">For </w:t>
       </w:r>
       <w:r>
@@ -1609,7 +1616,6 @@
         <w:pStyle w:val="Heading3"/>
       </w:pPr>
       <w:r>
-        <w:lastRenderedPageBreak/>
         <w:t xml:space="preserve">Training </w:t>
       </w:r>
       <w:r>
@@ -1742,6 +1748,7 @@
         <w:rPr>
           <w:noProof/>
         </w:rPr>
+        <w:lastRenderedPageBreak/>
         <w:drawing>
           <wp:inline distT="0" distB="0" distL="0" distR="0" wp14:anchorId="35D62568">
             <wp:extent cx="4661206" cy="2743200"/>
@@ -1829,9 +1836,11 @@
         <w:pStyle w:val="Heading2"/>
       </w:pPr>
       <w:r>
-        <w:lastRenderedPageBreak/>
         <w:t>Architecture</w:t>
       </w:r>
+      <w:r>
+        <w:t>s</w:t>
+      </w:r>
     </w:p>
     <w:p>
       <w:r>
@@ -1846,10 +1855,7 @@
     </w:p>
     <w:p>
       <w:r>
-        <w:t>We investigated three broad architectural styles with several fine-tuning variations.</w:t>
-      </w:r>
-      <w:r>
-        <w:t xml:space="preserve"> </w:t>
+        <w:t xml:space="preserve">We investigated three broad architectural styles with several fine-tuning variations. </w:t>
       </w:r>
       <w:r>
         <w:t>The basic framework for our architecture is the form of a UNet, defined as a number of convolution bloc</w:t>
@@ -1894,6 +1900,7 @@
         <w:rPr>
           <w:noProof/>
         </w:rPr>
+        <w:lastRenderedPageBreak/>
         <w:drawing>
           <wp:inline distT="0" distB="0" distL="0" distR="0" wp14:anchorId="271922DE">
             <wp:extent cx="6058138" cy="3069203"/>
@@ -1964,7 +1971,7 @@
         <w:rPr>
           <w:noProof/>
         </w:rPr>
-        <w:t>6</w:t>
+        <w:t>5</w:t>
       </w:r>
       <w:r>
         <w:fldChar w:fldCharType="end"/>
@@ -2063,6 +2070,14 @@
     <w:p>
       <w:r>
         <w:t>A comparison of all three approaches in how the convolution blocks (green bounded region in Figure xxx) were created is shown in Figure xxx.</w:t>
+      </w:r>
+    </w:p>
+    <w:p>
+      <w:pPr>
+        <w:pStyle w:val="Heading3"/>
+      </w:pPr>
+      <w:r>
+        <w:t>Vanilla UNet</w:t>
       </w:r>
     </w:p>
     <w:p>
@@ -2187,8 +2202,15 @@
       </w:r>
     </w:p>
     <w:p>
-      <w:r>
-        <w:lastRenderedPageBreak/>
+      <w:pPr>
+        <w:pStyle w:val="Heading3"/>
+      </w:pPr>
+      <w:r>
+        <w:t>Residual UNet</w:t>
+      </w:r>
+    </w:p>
+    <w:p>
+      <w:r>
         <w:t>Next, we investigated using residual connections for each convolution block in each</w:t>
       </w:r>
       <w:r>
@@ -2233,6 +2255,7 @@
         </w:numPr>
       </w:pPr>
       <w:r>
+        <w:lastRenderedPageBreak/>
         <w:t>Number of layers</w:t>
       </w:r>
       <w:r>
@@ -2248,10 +2271,7 @@
         </w:numPr>
       </w:pPr>
       <w:r>
-        <w:t>Initial number of convolution blocks were varied from 1, 2, 3</w:t>
-      </w:r>
-      <w:r>
-        <w:t>, and 4</w:t>
+        <w:t>Initial number of convolution blocks were varied from 1, 2, 3, and 4</w:t>
       </w:r>
     </w:p>
     <w:p>
@@ -2309,6 +2329,14 @@
       </w:r>
     </w:p>
     <w:p>
+      <w:pPr>
+        <w:pStyle w:val="Heading3"/>
+      </w:pPr>
+      <w:r>
+        <w:t>Dense UNet</w:t>
+      </w:r>
+    </w:p>
+    <w:p>
       <w:r>
         <w:t>A more complete ‘flow’ of lo</w:t>
       </w:r>
@@ -2381,10 +2409,7 @@
     </w:p>
     <w:p>
       <w:r>
-        <w:t>Dense Network</w:t>
-      </w:r>
-      <w:r>
-        <w:t xml:space="preserve"> Architecture Parameters:</w:t>
+        <w:t>Dense Network Architecture Parameters:</w:t>
       </w:r>
     </w:p>
     <w:p>
@@ -2396,13 +2421,7 @@
         </w:numPr>
       </w:pPr>
       <w:r>
-        <w:t xml:space="preserve">Number of layers were varied from </w:t>
-      </w:r>
-      <w:r>
-        <w:t xml:space="preserve">2, </w:t>
-      </w:r>
-      <w:r>
-        <w:t>and 3</w:t>
+        <w:t>Number of layers were varied from 2, and 3</w:t>
       </w:r>
     </w:p>
     <w:p>
@@ -2414,10 +2433,7 @@
         </w:numPr>
       </w:pPr>
       <w:r>
-        <w:t>Initial number of convolution blocks were</w:t>
-      </w:r>
-      <w:r>
-        <w:t xml:space="preserve"> 2</w:t>
+        <w:t>Initial number of convolution blocks were 2</w:t>
       </w:r>
     </w:p>
     <w:p>
@@ -2429,10 +2445,7 @@
         </w:numPr>
       </w:pPr>
       <w:r>
-        <w:t xml:space="preserve">The increase in number of convolution blocks (convolution lambda) for each layer was varied from 0, </w:t>
-      </w:r>
-      <w:r>
-        <w:t>and 1</w:t>
+        <w:t>The increase in number of convolution blocks (convolution lambda) for each layer was varied from 0, and 1</w:t>
       </w:r>
     </w:p>
     <w:p>
@@ -2456,10 +2469,7 @@
         </w:numPr>
       </w:pPr>
       <w:r>
-        <w:t xml:space="preserve">The number of initial </w:t>
-      </w:r>
-      <w:r>
-        <w:t>filters was 8, and 12</w:t>
+        <w:t>The number of initial filters was 8, and 12</w:t>
       </w:r>
     </w:p>
     <w:p>
@@ -2483,10 +2493,7 @@
         </w:numPr>
       </w:pPr>
       <w:r>
-        <w:t xml:space="preserve">The maximum number of filters was </w:t>
-      </w:r>
-      <w:r>
-        <w:t>infinity</w:t>
+        <w:t>The maximum number of filters was infinity</w:t>
       </w:r>
     </w:p>
     <w:p>
@@ -2570,7 +2577,7 @@
         <w:rPr>
           <w:noProof/>
         </w:rPr>
-        <w:t>7</w:t>
+        <w:t>6</w:t>
       </w:r>
       <w:r>
         <w:fldChar w:fldCharType="end"/>
@@ -2598,7 +2605,7 @@
         <w:fldChar w:fldCharType="begin" w:fldLock="1"/>
       </w:r>
       <w:r>
-        <w:instrText>ADDIN CSL_CITATION {"citationItems":[{"id":"ITEM-1","itemData":{"URL":"https://www.nvidia.com/en-gb/data-center/tesla-v100/","accessed":{"date-parts":[["2020","7","28"]]},"id":"ITEM-1","issued":{"date-parts":[["0"]]},"title":"NVIDIA Tesla V100 | NVIDIA","type":"webpage"},"uris":["http://www.mendeley.com/documents/?uuid=16ffd798-2c34-3c8c-a70d-8f4f5c82e56a"]}],"mendeley":{"formattedCitation":"(&lt;i&gt;NVIDIA Tesla V100 | NVIDIA&lt;/i&gt;, n.d.)","plainTextFormattedCitation":"(NVIDIA Tesla V100 | NVIDIA, n.d.)"},"properties":{"noteIndex":0},"schema":"https://github.com/citation-style-language/schema/raw/master/csl-citation.json"}</w:instrText>
+        <w:instrText>ADDIN CSL_CITATION {"citationItems":[{"id":"ITEM-1","itemData":{"URL":"https://www.nvidia.com/en-gb/data-center/tesla-v100/","accessed":{"date-parts":[["2020","7","28"]]},"id":"ITEM-1","issued":{"date-parts":[["0"]]},"title":"NVIDIA Tesla V100 | NVIDIA","type":"webpage"},"uris":["http://www.mendeley.com/documents/?uuid=16ffd798-2c34-3c8c-a70d-8f4f5c82e56a"]}],"mendeley":{"formattedCitation":"(&lt;i&gt;NVIDIA Tesla V100 | NVIDIA&lt;/i&gt;, n.d.)","plainTextFormattedCitation":"(NVIDIA Tesla V100 | NVIDIA, n.d.)","previouslyFormattedCitation":"(&lt;i&gt;NVIDIA Tesla V100 | NVIDIA&lt;/i&gt;, n.d.)"},"properties":{"noteIndex":0},"schema":"https://github.com/citation-style-language/schema/raw/master/csl-citation.json"}</w:instrText>
       </w:r>
       <w:r>
         <w:fldChar w:fldCharType="separate"/>
@@ -2650,10 +2657,24 @@
         <w:t>.</w:t>
       </w:r>
       <w:r>
-        <w:t xml:space="preserve"> Each model is trained using batches of randomly selected </w:t>
-      </w:r>
-      <w:r>
-        <w:t xml:space="preserve">eight randomly selected </w:t>
+        <w:t xml:space="preserve"> </w:t>
+      </w:r>
+    </w:p>
+    <w:p>
+      <w:r>
+        <w:t xml:space="preserve">Model inputs are formed by taking </w:t>
+      </w:r>
+      <w:r>
+        <w:t xml:space="preserve">eight </w:t>
+      </w:r>
+      <w:r>
+        <w:t xml:space="preserve">randomly selected </w:t>
+      </w:r>
+      <w:r>
+        <w:t>cubes to form an 8x32x12</w:t>
+      </w:r>
+      <w:r>
+        <w:t>0x120x1 image. A binary mask of the liver is passed as a secondary input to the model, automatically setting the prediction of disease outside of the liver to be 0 as any disease should be within the liver contour.</w:t>
       </w:r>
     </w:p>
     <w:p>
@@ -2661,20 +2682,269 @@
         <w:pStyle w:val="Heading3"/>
       </w:pPr>
       <w:r>
-        <w:t>Training Image Presentation</w:t>
-      </w:r>
-    </w:p>
-    <w:p>
-      <w:r>
-        <w:t xml:space="preserve">Initial attempts at </w:t>
-      </w:r>
+        <w:t>Hyper-Parameters</w:t>
+      </w:r>
+    </w:p>
+    <w:p>
+      <w:r>
+        <w:t xml:space="preserve">The learning rate </w:t>
+      </w:r>
+      <w:r>
+        <w:t>is known</w:t>
+      </w:r>
+      <w:r>
+        <w:t xml:space="preserve"> to be one of the most important </w:t>
+      </w:r>
+      <w:r>
+        <w:t>variables</w:t>
+      </w:r>
+      <w:r>
+        <w:t xml:space="preserve"> in determining a model’s ability to converge</w:t>
+      </w:r>
+      <w:r>
+        <w:t>, and optimal rates will vary based on the architecture depth (layers), number of convolution blocks, and number of filters in each block. For each model, a variation on the cyclical learning rate</w:t>
+      </w:r>
+      <w:r>
+        <w:fldChar w:fldCharType="begin" w:fldLock="1"/>
+      </w:r>
+      <w:r>
+        <w:instrText>ADDIN CSL_CITATION {"citationItems":[{"id":"ITEM-1","itemData":{"abstract":"It is known that the learning rate is the most important hyper-parameter to tune for training deep neural networks. This paper describes a new method for setting the learning rate, named cyclical learning rates, which practically eliminates the need to experimentally find the best values and schedule for the global learning rates. Instead of mono-tonically decreasing the learning rate, this method lets the learning rate cyclically vary between reasonable boundary values. Training with cyclical learning rates instead of fixed values achieves improved classification accuracy without a need to tune and often in fewer iterations. This paper also describes a simple way to estimate \"reasonable bounds\"-linearly increasing the learning rate of the network for a few epochs. In addition, cyclical learning rates are demonstrated on the CIFAR-10 and CIFAR-100 datasets with ResNets, Stochastic Depth networks, and DenseNets, and the ImageNet dataset with the AlexNet and GoogLeNet architectures. These are practical tools for everyone who trains neural networks.","author":[{"dropping-particle":"","family":"Smith","given":"Leslie N","non-dropping-particle":"","parse-names":false,"suffix":""}],"id":"ITEM-1","issued":{"date-parts":[["0"]]},"title":"Cyclical Learning Rates for Training Neural Networks","type":"report"},"uris":["http://www.mendeley.com/documents/?uuid=64e4e4a4-e785-36d1-a9bb-de9290f19a9b"]}],"mendeley":{"formattedCitation":"(Smith, n.d.)","plainTextFormattedCitation":"(Smith, n.d.)"},"properties":{"noteIndex":0},"schema":"https://github.com/citation-style-language/schema/raw/master/csl-citation.json"}</w:instrText>
+      </w:r>
+      <w:r>
+        <w:fldChar w:fldCharType="separate"/>
+      </w:r>
+      <w:r>
+        <w:rPr>
+          <w:noProof/>
+        </w:rPr>
+        <w:t>(Smith, n.d.)</w:t>
+      </w:r>
+      <w:r>
+        <w:fldChar w:fldCharType="end"/>
+      </w:r>
+      <w:r>
+        <w:t xml:space="preserve"> is used</w:t>
+      </w:r>
+      <w:r>
+        <w:t xml:space="preserve"> (</w:t>
+      </w:r>
+      <w:r>
+        <w:t>link to GitHub, anonymized for now</w:t>
+      </w:r>
+      <w:r>
+        <w:t>)</w:t>
+      </w:r>
+      <w:r>
+        <w:t xml:space="preserve">, where the model starts training at a minimum learning rate before </w:t>
+      </w:r>
+      <w:r>
+        <w:t xml:space="preserve">linearly </w:t>
+      </w:r>
+      <w:r>
+        <w:t>increasing to the maximum and back down to the minimum</w:t>
+      </w:r>
+      <w:r>
+        <w:t>,</w:t>
+      </w:r>
+      <w:r>
+        <w:t xml:space="preserve"> Figure xxx. Our version allows the user to select the fraction of previous max (shown as ½), and allo</w:t>
+      </w:r>
+      <w:r>
+        <w:t>ws the user to define a fraction that the minimum learning rate decreases by each cycle.</w:t>
+      </w:r>
+    </w:p>
+    <w:p>
+      <w:pPr>
+        <w:keepNext/>
+      </w:pPr>
+      <w:r>
+        <w:rPr>
+          <w:noProof/>
+        </w:rPr>
+        <w:lastRenderedPageBreak/>
+        <w:drawing>
+          <wp:inline distT="0" distB="0" distL="0" distR="0" wp14:anchorId="52F061B6">
+            <wp:extent cx="5476469" cy="5943600"/>
+            <wp:effectExtent l="0" t="0" r="0" b="0"/>
+            <wp:docPr id="8" name="Picture 8"/>
+            <wp:cNvGraphicFramePr>
+              <a:graphicFrameLocks xmlns:a="http://schemas.openxmlformats.org/drawingml/2006/main" noChangeAspect="1"/>
+            </wp:cNvGraphicFramePr>
+            <a:graphic xmlns:a="http://schemas.openxmlformats.org/drawingml/2006/main">
+              <a:graphicData uri="http://schemas.openxmlformats.org/drawingml/2006/picture">
+                <pic:pic xmlns:pic="http://schemas.openxmlformats.org/drawingml/2006/picture">
+                  <pic:nvPicPr>
+                    <pic:cNvPr id="0" name="Picture 2"/>
+                    <pic:cNvPicPr>
+                      <a:picLocks noChangeAspect="1" noChangeArrowheads="1"/>
+                    </pic:cNvPicPr>
+                  </pic:nvPicPr>
+                  <pic:blipFill>
+                    <a:blip r:embed="rId16" cstate="print">
+                      <a:extLst>
+                        <a:ext uri="{28A0092B-C50C-407E-A947-70E740481C1C}">
+                          <a14:useLocalDpi xmlns:a14="http://schemas.microsoft.com/office/drawing/2010/main" val="0"/>
+                        </a:ext>
+                      </a:extLst>
+                    </a:blip>
+                    <a:srcRect/>
+                    <a:stretch>
+                      <a:fillRect/>
+                    </a:stretch>
+                  </pic:blipFill>
+                  <pic:spPr bwMode="auto">
+                    <a:xfrm>
+                      <a:off x="0" y="0"/>
+                      <a:ext cx="5476469" cy="5943600"/>
+                    </a:xfrm>
+                    <a:prstGeom prst="rect">
+                      <a:avLst/>
+                    </a:prstGeom>
+                    <a:noFill/>
+                  </pic:spPr>
+                </pic:pic>
+              </a:graphicData>
+            </a:graphic>
+          </wp:inline>
+        </w:drawing>
+      </w:r>
+    </w:p>
+    <w:p>
+      <w:pPr>
+        <w:pStyle w:val="Caption"/>
+      </w:pPr>
+      <w:r>
+        <w:t xml:space="preserve">Figure </w:t>
+      </w:r>
+      <w:r>
+        <w:fldChar w:fldCharType="begin"/>
+      </w:r>
+      <w:r>
+        <w:instrText xml:space="preserve"> SEQ Figure \* ARABIC </w:instrText>
+      </w:r>
+      <w:r>
+        <w:fldChar w:fldCharType="separate"/>
+      </w:r>
+      <w:r>
+        <w:rPr>
+          <w:noProof/>
+        </w:rPr>
+        <w:t>7</w:t>
+      </w:r>
+      <w:r>
+        <w:fldChar w:fldCharType="end"/>
+      </w:r>
+      <w:r>
+        <w:t>: Cyclical Learning Rate for 1e-10 to 1e-9, assuming a step size of 5 and step size factor of 5. (Top)  Linear representation and (Bottom) log representation.</w:t>
+      </w:r>
+      <w:r>
+        <w:t xml:space="preserve"> </w:t>
+      </w:r>
+    </w:p>
+    <w:p>
+      <w:r>
+        <w:t xml:space="preserve">The minimum and maximum learning rate are found via small adaptations of code presented here </w:t>
+      </w:r>
+      <w:hyperlink r:id="rId17" w:history="1">
+        <w:r>
+          <w:rPr>
+            <w:rStyle w:val="Hyperlink"/>
+          </w:rPr>
+          <w:t>https://www.pyimagesearch.com/2019/08/05/keras-learning-rate-finder/</w:t>
+        </w:r>
+      </w:hyperlink>
+      <w:r>
+        <w:t>, our own variation of the code can be found at our github page, link to github anonymized*. This code functions by slowly increasing the learning rate from a very low value (~1e-10) to a large value (~1-e-1), and training solely on the training dataset. The point where the loss begins to decrease refers to the minimum learning rate, and the point where it begins to increase again is the maximum learning rate, Figure xxx.</w:t>
+      </w:r>
+    </w:p>
+    <w:p>
+      <w:pPr>
+        <w:keepNext/>
+      </w:pPr>
+      <w:r>
+        <w:rPr>
+          <w:noProof/>
+        </w:rPr>
+        <w:lastRenderedPageBreak/>
+        <w:drawing>
+          <wp:inline distT="0" distB="0" distL="0" distR="0" wp14:anchorId="37926C41">
+            <wp:extent cx="4597879" cy="3448534"/>
+            <wp:effectExtent l="0" t="0" r="0" b="0"/>
+            <wp:docPr id="17" name="Picture 17"/>
+            <wp:cNvGraphicFramePr>
+              <a:graphicFrameLocks xmlns:a="http://schemas.openxmlformats.org/drawingml/2006/main" noChangeAspect="1"/>
+            </wp:cNvGraphicFramePr>
+            <a:graphic xmlns:a="http://schemas.openxmlformats.org/drawingml/2006/main">
+              <a:graphicData uri="http://schemas.openxmlformats.org/drawingml/2006/picture">
+                <pic:pic xmlns:pic="http://schemas.openxmlformats.org/drawingml/2006/picture">
+                  <pic:nvPicPr>
+                    <pic:cNvPr id="0" name="Picture 3"/>
+                    <pic:cNvPicPr>
+                      <a:picLocks noChangeAspect="1" noChangeArrowheads="1"/>
+                    </pic:cNvPicPr>
+                  </pic:nvPicPr>
+                  <pic:blipFill>
+                    <a:blip r:embed="rId18">
+                      <a:extLst>
+                        <a:ext uri="{28A0092B-C50C-407E-A947-70E740481C1C}">
+                          <a14:useLocalDpi xmlns:a14="http://schemas.microsoft.com/office/drawing/2010/main" val="0"/>
+                        </a:ext>
+                      </a:extLst>
+                    </a:blip>
+                    <a:srcRect/>
+                    <a:stretch>
+                      <a:fillRect/>
+                    </a:stretch>
+                  </pic:blipFill>
+                  <pic:spPr bwMode="auto">
+                    <a:xfrm>
+                      <a:off x="0" y="0"/>
+                      <a:ext cx="4604532" cy="3453524"/>
+                    </a:xfrm>
+                    <a:prstGeom prst="rect">
+                      <a:avLst/>
+                    </a:prstGeom>
+                    <a:noFill/>
+                  </pic:spPr>
+                </pic:pic>
+              </a:graphicData>
+            </a:graphic>
+          </wp:inline>
+        </w:drawing>
+      </w:r>
+    </w:p>
+    <w:p>
+      <w:pPr>
+        <w:pStyle w:val="Caption"/>
+      </w:pPr>
+      <w:r>
+        <w:t xml:space="preserve">Figure </w:t>
+      </w:r>
+      <w:r>
+        <w:fldChar w:fldCharType="begin"/>
+      </w:r>
+      <w:r>
+        <w:instrText xml:space="preserve"> SEQ Figure \* ARABIC </w:instrText>
+      </w:r>
+      <w:r>
+        <w:fldChar w:fldCharType="separate"/>
+      </w:r>
+      <w:r>
+        <w:rPr>
+          <w:noProof/>
+        </w:rPr>
+        <w:t>8</w:t>
+      </w:r>
+      <w:r>
+        <w:fldChar w:fldCharType="end"/>
+      </w:r>
+      <w:r>
+        <w:t>: Learning Rate Finder figure. Learning rate is gradually increased from 10e-7 to 10e-0, the point where loss begins to decrease is the minimum learning rate (Min LR), the point where it begins to increase is the maximum learning rate (Max LR).</w:t>
+      </w:r>
+    </w:p>
+    <w:p>
       <w:bookmarkStart w:id="0" w:name="_GoBack"/>
       <w:bookmarkEnd w:id="0"/>
-    </w:p>
-    <w:p>
-      <w:r>
-        <w:t>Leveraging our previous success with liver segmentation, we begin the task of disease segmentation by searching within the bounding box of the liver. Our architecture consists of multiple atrous convolutions combined with residual connections. The atrous convolutions maintain image resolution while gradually increasing receptive field size, and residual connections ensure that previous activations are propagated through the network. The model was trained by randomly pulling cubes of disease from patients in the training set. Hyper parameters for the model include training with a cyclical learning rate, varying cube size, and optimizer to be either Stochastic Gradient Descent or Adam.</w:t>
-      </w:r>
     </w:p>
     <w:sectPr>
       <w:pgSz w:w="12240" w:h="15840"/>
@@ -3436,7 +3706,6 @@
     <w:name w:val="Hyperlink"/>
     <w:basedOn w:val="DefaultParagraphFont"/>
     <w:uiPriority w:val="99"/>
-    <w:semiHidden/>
     <w:unhideWhenUsed/>
     <w:rsid w:val="006E5402"/>
     <w:rPr>
@@ -3788,7 +4057,7 @@
 </file>
 
 <file path=customXml/itemProps1.xml><?xml version="1.0" encoding="utf-8"?>
-<ds:datastoreItem xmlns:ds="http://schemas.openxmlformats.org/officeDocument/2006/customXml" ds:itemID="{EFFB9497-CCF0-4CAE-AA1E-F9BB8A0029F1}">
+<ds:datastoreItem xmlns:ds="http://schemas.openxmlformats.org/officeDocument/2006/customXml" ds:itemID="{36285EA1-8DB6-4D7C-8B18-EC00B106455F}">
   <ds:schemaRefs>
     <ds:schemaRef ds:uri="http://schemas.openxmlformats.org/officeDocument/2006/bibliography"/>
   </ds:schemaRefs>

</xml_diff>